<commit_message>
docs: reflect DX expected schedule (Nov test, Dec rollout)
Co-Authored-By: Claude Opus 5.5 <noreply@anthropic.com>
Claude-Session: https://claude.ai/code/session_01Ev2GcePRwbwZKfH9HbtDvV
</commit_message>
<xml_diff>
--- a/docs/scrap-highlight/스크랩하이라이트_DS도입_추진현황.docx
+++ b/docs/scrap-highlight/스크랩하이라이트_DS도입_추진현황.docx
@@ -183,7 +183,7 @@
           <w:sz w:val="20"/>
           <w:szCs w:val="20"/>
         </w:rPr>
-        <w:t xml:space="preserve">DS 목표: DX와 동일 시점 도입</w:t>
+        <w:t xml:space="preserve">DS 목표: DX와 동일하게 11월 테스트, 12월 적용</w:t>
       </w:r>
     </w:p>
     <w:p>
@@ -374,7 +374,7 @@
                 <w:sz w:val="18"/>
                 <w:szCs w:val="18"/>
               </w:rPr>
-              <w:t xml:space="preserve">현재 사용 환경 준비 중이며, 도입일은 미정</w:t>
+              <w:t xml:space="preserve">그룹 권고 일정에 맞춰 11월 테스트, 12월 적용 예정</w:t>
             </w:r>
           </w:p>
         </w:tc>
@@ -1463,7 +1463,7 @@
                 <w:sz w:val="18"/>
                 <w:szCs w:val="18"/>
               </w:rPr>
-              <w:t xml:space="preserve">즉시 병행 착수</w:t>
+              <w:t xml:space="preserve">즉시 병행 착수 (11월 테스트 전 완료)</w:t>
             </w:r>
           </w:p>
         </w:tc>
@@ -1526,7 +1526,7 @@
                 <w:sz w:val="18"/>
                 <w:szCs w:val="18"/>
               </w:rPr>
-              <w:t xml:space="preserve">미정</w:t>
+              <w:t xml:space="preserve">11월</w:t>
             </w:r>
           </w:p>
         </w:tc>
@@ -1556,7 +1556,7 @@
                 <w:sz w:val="18"/>
                 <w:szCs w:val="18"/>
               </w:rPr>
-              <w:t xml:space="preserve">환경 준비 완료 후 약 2주</w:t>
+              <w:t xml:space="preserve">11월</w:t>
             </w:r>
           </w:p>
         </w:tc>
@@ -1619,7 +1619,7 @@
                 <w:sz w:val="18"/>
                 <w:szCs w:val="18"/>
               </w:rPr>
-              <w:t xml:space="preserve">미정</w:t>
+              <w:t xml:space="preserve">12월</w:t>
             </w:r>
           </w:p>
         </w:tc>
@@ -1649,7 +1649,7 @@
                 <w:sz w:val="18"/>
                 <w:szCs w:val="18"/>
               </w:rPr>
-              <w:t xml:space="preserve">DX와 동일 시점 (늦어도 12월)</w:t>
+              <w:t xml:space="preserve">12월 (DX와 동일)</w:t>
             </w:r>
           </w:p>
         </w:tc>
@@ -1666,7 +1666,7 @@
           <w:sz w:val="18"/>
           <w:szCs w:val="18"/>
         </w:rPr>
-        <w:t xml:space="preserve">※ DX 도입일 확인 후 DS 일정 확정 예정</w:t>
+        <w:t xml:space="preserve">※ DX 세부 일자 확정 시 DS 일정도 맞춰 확정 예정</w:t>
       </w:r>
     </w:p>
     <w:p>
@@ -1704,7 +1704,7 @@
           <w:sz w:val="20"/>
           <w:szCs w:val="20"/>
         </w:rPr>
-        <w:t xml:space="preserve">보안 절차·계정 발급에 시간이 소요될 수 있어 지원 요청과 병행해 즉시 착수</w:t>
+        <w:t xml:space="preserve">11월 테스트에 맞추려면 보안 절차·계정 발급을 10월 중 착수해야 함 → 지원 요청과 병행</w:t>
       </w:r>
     </w:p>
     <w:p>

</xml_diff>